<commit_message>
Ecopath 40 years edition
git-svn-id: https://sources.ecopath.org/svn/Ecopath/trunk/Ecopath6@18866 a725721c-0ed6-864e-a6a8-02c2a1988c9d
</commit_message>
<xml_diff>
--- a/Documentation/Misc writeups/EwE 6.7 release notes.docx
+++ b/Documentation/Misc writeups/EwE 6.7 release notes.docx
@@ -131,7 +131,10 @@
     </w:p>
     <w:p>
       <w:r>
-        <w:t>The spatial temporal framework (available through projects) can drive current patterns, too.</w:t>
+        <w:t>The spatial temporal framework (available through projects) can drive current patterns</w:t>
+      </w:r>
+      <w:r>
+        <w:t>, too.</w:t>
       </w:r>
     </w:p>
     <w:p>
@@ -163,16 +166,16 @@
       </w:r>
     </w:p>
     <w:p>
+      <w:bookmarkStart w:id="0" w:name="_GoBack"/>
       <w:r>
         <w:t>New time series to dynamically alter Ecopath fishing costs proportions, prices</w:t>
       </w:r>
+      <w:bookmarkEnd w:id="0"/>
     </w:p>
     <w:p>
       <w:r>
         <w:t xml:space="preserve">Standardized time series display </w:t>
       </w:r>
-      <w:bookmarkStart w:id="0" w:name="_GoBack"/>
-      <w:bookmarkEnd w:id="0"/>
     </w:p>
     <w:p>
       <w:r>
@@ -1823,6 +1826,7 @@
     <w:lsdException w:name="HTML Sample" w:semiHidden="1" w:unhideWhenUsed="1"/>
     <w:lsdException w:name="HTML Typewriter" w:semiHidden="1" w:unhideWhenUsed="1"/>
     <w:lsdException w:name="HTML Variable" w:semiHidden="1" w:unhideWhenUsed="1"/>
+    <w:lsdException w:name="Normal Table" w:semiHidden="1" w:unhideWhenUsed="1"/>
     <w:lsdException w:name="annotation subject" w:semiHidden="1" w:unhideWhenUsed="1"/>
     <w:lsdException w:name="No List" w:semiHidden="1" w:unhideWhenUsed="1"/>
     <w:lsdException w:name="Outline List 1" w:semiHidden="1" w:unhideWhenUsed="1"/>
@@ -1866,8 +1870,10 @@
     <w:lsdException w:name="Table Elegant" w:semiHidden="1" w:unhideWhenUsed="1"/>
     <w:lsdException w:name="Table Professional" w:semiHidden="1" w:unhideWhenUsed="1"/>
     <w:lsdException w:name="Table Subtle 1" w:semiHidden="1" w:unhideWhenUsed="1"/>
+    <w:lsdException w:name="Table Subtle 2" w:semiHidden="1" w:unhideWhenUsed="1"/>
     <w:lsdException w:name="Table Web 1" w:semiHidden="1" w:unhideWhenUsed="1"/>
     <w:lsdException w:name="Table Web 2" w:semiHidden="1" w:unhideWhenUsed="1"/>
+    <w:lsdException w:name="Table Web 3" w:semiHidden="1" w:unhideWhenUsed="1"/>
     <w:lsdException w:name="Balloon Text" w:semiHidden="1" w:unhideWhenUsed="1"/>
     <w:lsdException w:name="Table Grid" w:uiPriority="39"/>
     <w:lsdException w:name="Table Theme" w:semiHidden="1" w:unhideWhenUsed="1"/>

</xml_diff>

<commit_message>
Ecosampler fix, v 6.7.0.19264
git-svn-id: https://sources.ecopath.org/svn/Ecopath/trunk/Ecopath6@19264 a725721c-0ed6-864e-a6a8-02c2a1988c9d
</commit_message>
<xml_diff>
--- a/Documentation/Misc writeups/EwE 6.7 release notes.docx
+++ b/Documentation/Misc writeups/EwE 6.7 release notes.docx
@@ -1,6 +1,6 @@
 
 <file path=word/document.xml><?xml version="1.0" encoding="utf-8"?>
-<w:document xmlns:wpc="http://schemas.microsoft.com/office/word/2010/wordprocessingCanvas" xmlns:cx="http://schemas.microsoft.com/office/drawing/2014/chartex" xmlns:cx1="http://schemas.microsoft.com/office/drawing/2015/9/8/chartex" xmlns:cx2="http://schemas.microsoft.com/office/drawing/2015/10/21/chartex" xmlns:cx3="http://schemas.microsoft.com/office/drawing/2016/5/9/chartex" xmlns:cx4="http://schemas.microsoft.com/office/drawing/2016/5/10/chartex" xmlns:cx5="http://schemas.microsoft.com/office/drawing/2016/5/11/chartex" xmlns:cx6="http://schemas.microsoft.com/office/drawing/2016/5/12/chartex" xmlns:cx7="http://schemas.microsoft.com/office/drawing/2016/5/13/chartex" xmlns:cx8="http://schemas.microsoft.com/office/drawing/2016/5/14/chartex" xmlns:mc="http://schemas.openxmlformats.org/markup-compatibility/2006" xmlns:aink="http://schemas.microsoft.com/office/drawing/2016/ink" xmlns:am3d="http://schemas.microsoft.com/office/drawing/2017/model3d" xmlns:o="urn:schemas-microsoft-com:office:office" xmlns:oel="http://schemas.microsoft.com/office/2019/extlst" xmlns:r="http://schemas.openxmlformats.org/officeDocument/2006/relationships" xmlns:m="http://schemas.openxmlformats.org/officeDocument/2006/math" xmlns:v="urn:schemas-microsoft-com:vml" xmlns:wp14="http://schemas.microsoft.com/office/word/2010/wordprocessingDrawing" xmlns:wp="http://schemas.openxmlformats.org/drawingml/2006/wordprocessingDrawing" xmlns:w10="urn:schemas-microsoft-com:office:word" xmlns:w="http://schemas.openxmlformats.org/wordprocessingml/2006/main" xmlns:w14="http://schemas.microsoft.com/office/word/2010/wordml" xmlns:w15="http://schemas.microsoft.com/office/word/2012/wordml" xmlns:w16cex="http://schemas.microsoft.com/office/word/2018/wordml/cex" xmlns:w16cid="http://schemas.microsoft.com/office/word/2016/wordml/cid" xmlns:w16="http://schemas.microsoft.com/office/word/2018/wordml" xmlns:w16du="http://schemas.microsoft.com/office/word/2023/wordml/word16du" xmlns:w16sdtdh="http://schemas.microsoft.com/office/word/2020/wordml/sdtdatahash" xmlns:w16se="http://schemas.microsoft.com/office/word/2015/wordml/symex" xmlns:wpg="http://schemas.microsoft.com/office/word/2010/wordprocessingGroup" xmlns:wpi="http://schemas.microsoft.com/office/word/2010/wordprocessingInk" xmlns:wne="http://schemas.microsoft.com/office/word/2006/wordml" xmlns:wps="http://schemas.microsoft.com/office/word/2010/wordprocessingShape" mc:Ignorable="w14 w15 w16se w16cid w16 w16cex w16sdtdh w16du wp14">
+<w:document xmlns:wpc="http://schemas.microsoft.com/office/word/2010/wordprocessingCanvas" xmlns:cx="http://schemas.microsoft.com/office/drawing/2014/chartex" xmlns:cx1="http://schemas.microsoft.com/office/drawing/2015/9/8/chartex" xmlns:cx2="http://schemas.microsoft.com/office/drawing/2015/10/21/chartex" xmlns:cx3="http://schemas.microsoft.com/office/drawing/2016/5/9/chartex" xmlns:cx4="http://schemas.microsoft.com/office/drawing/2016/5/10/chartex" xmlns:cx5="http://schemas.microsoft.com/office/drawing/2016/5/11/chartex" xmlns:cx6="http://schemas.microsoft.com/office/drawing/2016/5/12/chartex" xmlns:cx7="http://schemas.microsoft.com/office/drawing/2016/5/13/chartex" xmlns:cx8="http://schemas.microsoft.com/office/drawing/2016/5/14/chartex" xmlns:mc="http://schemas.openxmlformats.org/markup-compatibility/2006" xmlns:aink="http://schemas.microsoft.com/office/drawing/2016/ink" xmlns:am3d="http://schemas.microsoft.com/office/drawing/2017/model3d" xmlns:o="urn:schemas-microsoft-com:office:office" xmlns:oel="http://schemas.microsoft.com/office/2019/extlst" xmlns:r="http://schemas.openxmlformats.org/officeDocument/2006/relationships" xmlns:m="http://schemas.openxmlformats.org/officeDocument/2006/math" xmlns:v="urn:schemas-microsoft-com:vml" xmlns:wp14="http://schemas.microsoft.com/office/word/2010/wordprocessingDrawing" xmlns:wp="http://schemas.openxmlformats.org/drawingml/2006/wordprocessingDrawing" xmlns:w10="urn:schemas-microsoft-com:office:word" xmlns:w="http://schemas.openxmlformats.org/wordprocessingml/2006/main" xmlns:w14="http://schemas.microsoft.com/office/word/2010/wordml" xmlns:w15="http://schemas.microsoft.com/office/word/2012/wordml" xmlns:w16cex="http://schemas.microsoft.com/office/word/2018/wordml/cex" xmlns:w16cid="http://schemas.microsoft.com/office/word/2016/wordml/cid" xmlns:w16="http://schemas.microsoft.com/office/word/2018/wordml" xmlns:w16du="http://schemas.microsoft.com/office/word/2023/wordml/word16du" xmlns:w16sdtdh="http://schemas.microsoft.com/office/word/2020/wordml/sdtdatahash" xmlns:w16sdtfl="http://schemas.microsoft.com/office/word/2024/wordml/sdtformatlock" xmlns:w16se="http://schemas.microsoft.com/office/word/2015/wordml/symex" xmlns:wpg="http://schemas.microsoft.com/office/word/2010/wordprocessingGroup" xmlns:wpi="http://schemas.microsoft.com/office/word/2010/wordprocessingInk" xmlns:wne="http://schemas.microsoft.com/office/word/2006/wordml" xmlns:wps="http://schemas.microsoft.com/office/word/2010/wordprocessingShape" mc:Ignorable="w14 w15 w16se w16cid w16 w16cex w16sdtdh w16sdtfl w16du wp14">
   <w:body>
     <w:p>
       <w:pPr>
@@ -24,19 +24,19 @@
     </w:p>
     <w:p>
       <w:r>
-        <w:t>24</w:t>
+        <w:t>07</w:t>
       </w:r>
       <w:r>
         <w:t xml:space="preserve"> </w:t>
       </w:r>
       <w:r>
-        <w:t>Nov</w:t>
-      </w:r>
-      <w:r>
-        <w:t xml:space="preserve">ember </w:t>
-      </w:r>
-      <w:r>
-        <w:t>2024</w:t>
+        <w:t xml:space="preserve">March </w:t>
+      </w:r>
+      <w:r>
+        <w:t>202</w:t>
+      </w:r>
+      <w:r>
+        <w:t>5</w:t>
       </w:r>
     </w:p>
     <w:p>
@@ -82,19 +82,11 @@
         <w:t xml:space="preserve">. For a list of known issues with the software, please refer to the </w:t>
       </w:r>
       <w:hyperlink r:id="rId6" w:history="1">
-        <w:proofErr w:type="spellStart"/>
         <w:r>
           <w:rPr>
             <w:rStyle w:val="Hyperlink"/>
           </w:rPr>
-          <w:t>EwE</w:t>
-        </w:r>
-        <w:proofErr w:type="spellEnd"/>
-        <w:r>
-          <w:rPr>
-            <w:rStyle w:val="Hyperlink"/>
-          </w:rPr>
-          <w:t xml:space="preserve"> </w:t>
+          <w:t xml:space="preserve">EwE </w:t>
         </w:r>
         <w:r>
           <w:rPr>
@@ -111,770 +103,674 @@
       </w:r>
     </w:p>
     <w:p>
-      <w:pPr>
-        <w:rPr>
-          <w:i/>
-          <w:iCs/>
-        </w:rPr>
-      </w:pPr>
-      <w:r>
-        <w:rPr>
-          <w:i/>
-          <w:iCs/>
-        </w:rPr>
-        <w:t xml:space="preserve">Note that at the time of writing the </w:t>
+      <w:r>
+        <w:t xml:space="preserve">The most important </w:t>
+      </w:r>
+      <w:r>
+        <w:t>n</w:t>
+      </w:r>
+      <w:r>
+        <w:t>ew features in EwE 6.</w:t>
+      </w:r>
+      <w:r>
+        <w:t>7</w:t>
+      </w:r>
+      <w:r>
+        <w:t xml:space="preserve"> are:</w:t>
+      </w:r>
+    </w:p>
+    <w:p>
+      <w:pPr>
+        <w:rPr>
+          <w:b/>
+        </w:rPr>
+      </w:pPr>
+      <w:r>
+        <w:rPr>
+          <w:b/>
+        </w:rPr>
+        <w:t>Ecopath</w:t>
+      </w:r>
+    </w:p>
+    <w:p>
+      <w:pPr>
+        <w:pStyle w:val="ListParagraph"/>
+        <w:numPr>
+          <w:ilvl w:val="0"/>
+          <w:numId w:val="10"/>
+        </w:numPr>
+        <w:rPr>
+          <w:bCs/>
+        </w:rPr>
+      </w:pPr>
+      <w:r>
+        <w:rPr>
+          <w:bCs/>
+        </w:rPr>
+        <w:t>Added the ability to link recruitment between stanza groups</w:t>
+      </w:r>
+    </w:p>
+    <w:p>
+      <w:pPr>
+        <w:pStyle w:val="ListParagraph"/>
+        <w:numPr>
+          <w:ilvl w:val="0"/>
+          <w:numId w:val="10"/>
+        </w:numPr>
+        <w:rPr>
+          <w:bCs/>
+        </w:rPr>
+      </w:pPr>
+      <w:r>
+        <w:rPr>
+          <w:bCs/>
+        </w:rPr>
+        <w:t>Off-vessel prices can be negative</w:t>
+      </w:r>
+    </w:p>
+    <w:p>
+      <w:pPr>
+        <w:pStyle w:val="ListParagraph"/>
+        <w:numPr>
+          <w:ilvl w:val="0"/>
+          <w:numId w:val="10"/>
+        </w:numPr>
+        <w:rPr>
+          <w:bCs/>
+        </w:rPr>
+      </w:pPr>
+      <w:r>
+        <w:rPr>
+          <w:bCs/>
+        </w:rPr>
+        <w:t>Added diet tree diagrams</w:t>
+      </w:r>
+    </w:p>
+    <w:p>
+      <w:pPr>
+        <w:pStyle w:val="ListParagraph"/>
+        <w:numPr>
+          <w:ilvl w:val="0"/>
+          <w:numId w:val="10"/>
+        </w:numPr>
+        <w:rPr>
+          <w:bCs/>
+        </w:rPr>
+      </w:pPr>
+      <w:r>
+        <w:rPr>
+          <w:bCs/>
+        </w:rPr>
+        <w:t>Added energy content</w:t>
+      </w:r>
+    </w:p>
+    <w:p>
+      <w:pPr>
+        <w:rPr>
+          <w:b/>
+        </w:rPr>
+      </w:pPr>
+      <w:r>
+        <w:rPr>
+          <w:b/>
+        </w:rPr>
+        <w:t>Ecosim</w:t>
+      </w:r>
+    </w:p>
+    <w:p>
+      <w:pPr>
+        <w:pStyle w:val="ListParagraph"/>
+        <w:numPr>
+          <w:ilvl w:val="0"/>
+          <w:numId w:val="11"/>
+        </w:numPr>
+      </w:pPr>
+      <w:r>
+        <w:t>Added g</w:t>
+      </w:r>
+      <w:r>
+        <w:t>roup and fleet plots</w:t>
+      </w:r>
+    </w:p>
+    <w:p>
+      <w:pPr>
+        <w:pStyle w:val="ListParagraph"/>
+        <w:numPr>
+          <w:ilvl w:val="0"/>
+          <w:numId w:val="11"/>
+        </w:numPr>
+      </w:pPr>
+      <w:r>
+        <w:t>Added new time series to dynamically alter Ecopath fishing costs proportions, prices</w:t>
+      </w:r>
+    </w:p>
+    <w:p>
+      <w:pPr>
+        <w:pStyle w:val="ListParagraph"/>
+        <w:numPr>
+          <w:ilvl w:val="0"/>
+          <w:numId w:val="11"/>
+        </w:numPr>
+      </w:pPr>
+      <w:r>
+        <w:t>Added discard rate and discard mortality rates forcing in Ecosim, and model fitting to discards and landings time series.</w:t>
+      </w:r>
+    </w:p>
+    <w:p>
+      <w:pPr>
+        <w:pStyle w:val="ListParagraph"/>
+        <w:numPr>
+          <w:ilvl w:val="0"/>
+          <w:numId w:val="11"/>
+        </w:numPr>
+      </w:pPr>
+      <w:r>
+        <w:t>Added non-additive mortalities</w:t>
+      </w:r>
+    </w:p>
+    <w:p>
+      <w:pPr>
+        <w:pStyle w:val="ListParagraph"/>
+        <w:numPr>
+          <w:ilvl w:val="0"/>
+          <w:numId w:val="11"/>
+        </w:numPr>
+      </w:pPr>
+      <w:r>
+        <w:t>Catchabilities</w:t>
+      </w:r>
+      <w:r>
+        <w:t xml:space="preserve"> are now available as a new time series type</w:t>
+      </w:r>
+    </w:p>
+    <w:p>
+      <w:pPr>
+        <w:pStyle w:val="ListParagraph"/>
+        <w:numPr>
+          <w:ilvl w:val="0"/>
+          <w:numId w:val="11"/>
+        </w:numPr>
+      </w:pPr>
+      <w:r>
+        <w:t xml:space="preserve">Catch time series </w:t>
+      </w:r>
+      <w:r>
+        <w:t xml:space="preserve">(61) are </w:t>
+      </w:r>
+      <w:r>
+        <w:t>now included in SS calculations; SS will differ</w:t>
+      </w:r>
+      <w:r>
+        <w:t xml:space="preserve"> from EwE 6.6.*</w:t>
+      </w:r>
+    </w:p>
+    <w:p>
+      <w:pPr>
+        <w:pStyle w:val="ListParagraph"/>
+        <w:numPr>
+          <w:ilvl w:val="0"/>
+          <w:numId w:val="11"/>
+        </w:numPr>
+      </w:pPr>
+      <w:r>
+        <w:t xml:space="preserve">Display of </w:t>
+      </w:r>
+      <w:r>
+        <w:t xml:space="preserve">time series </w:t>
+      </w:r>
+      <w:r>
+        <w:t>has been standardized</w:t>
+      </w:r>
+    </w:p>
+    <w:p>
+      <w:pPr>
+        <w:pStyle w:val="Heading3"/>
+      </w:pPr>
+      <w:r>
+        <w:t>Ecospace</w:t>
+      </w:r>
+    </w:p>
+    <w:p>
+      <w:pPr>
+        <w:pStyle w:val="ListParagraph"/>
+        <w:numPr>
+          <w:ilvl w:val="0"/>
+          <w:numId w:val="6"/>
+        </w:numPr>
+      </w:pPr>
+      <w:r>
+        <w:t>The spatial temporal framework (available through projects) can drive current patterns, too.</w:t>
+      </w:r>
+    </w:p>
+    <w:p>
+      <w:pPr>
+        <w:pStyle w:val="ListParagraph"/>
+        <w:numPr>
+          <w:ilvl w:val="0"/>
+          <w:numId w:val="6"/>
+        </w:numPr>
+      </w:pPr>
+      <w:r>
+        <w:t>Added c</w:t>
+      </w:r>
+      <w:r>
+        <w:t>ell area</w:t>
+      </w:r>
+      <w:r>
+        <w:t xml:space="preserve"> maps</w:t>
+      </w:r>
+    </w:p>
+    <w:p>
+      <w:pPr>
+        <w:pStyle w:val="ListParagraph"/>
+        <w:numPr>
+          <w:ilvl w:val="0"/>
+          <w:numId w:val="6"/>
+        </w:numPr>
+      </w:pPr>
+      <w:r>
+        <w:t xml:space="preserve">Added </w:t>
+      </w:r>
+      <w:r>
+        <w:t>Effort zones</w:t>
+      </w:r>
+      <w:r>
+        <w:t xml:space="preserve"> maps</w:t>
+      </w:r>
+    </w:p>
+    <w:p>
+      <w:pPr>
+        <w:pStyle w:val="ListParagraph"/>
+        <w:numPr>
+          <w:ilvl w:val="0"/>
+          <w:numId w:val="6"/>
+        </w:numPr>
+      </w:pPr>
+      <w:r>
+        <w:t xml:space="preserve">The </w:t>
+      </w:r>
+      <w:r>
+        <w:t xml:space="preserve">IBM </w:t>
+      </w:r>
+      <w:r>
+        <w:t xml:space="preserve">model has been </w:t>
+      </w:r>
+      <w:r>
+        <w:t>made to work with currents</w:t>
+      </w:r>
+      <w:r>
+        <w:t xml:space="preserve"> and</w:t>
+      </w:r>
+      <w:r>
+        <w:t xml:space="preserve"> </w:t>
       </w:r>
       <w:proofErr w:type="spellStart"/>
       <w:r>
-        <w:rPr>
-          <w:i/>
-          <w:iCs/>
-        </w:rPr>
-        <w:t>EwE</w:t>
+        <w:t>EcoTracer</w:t>
       </w:r>
       <w:proofErr w:type="spellEnd"/>
-      <w:r>
-        <w:rPr>
-          <w:i/>
-          <w:iCs/>
-        </w:rPr>
+    </w:p>
+    <w:p>
+      <w:pPr>
+        <w:pStyle w:val="ListParagraph"/>
+        <w:numPr>
+          <w:ilvl w:val="0"/>
+          <w:numId w:val="6"/>
+        </w:numPr>
+      </w:pPr>
+      <w:r>
+        <w:t>Expanded regional averages output: consumption. Region 0 provides total Ecospace water cell average, weighted by cell area</w:t>
+      </w:r>
+    </w:p>
+    <w:p>
+      <w:pPr>
+        <w:rPr>
+          <w:b/>
+        </w:rPr>
+      </w:pPr>
+      <w:r>
+        <w:rPr>
+          <w:b/>
+        </w:rPr>
+        <w:t>Stepwise fitting</w:t>
+      </w:r>
+    </w:p>
+    <w:p>
+      <w:pPr>
+        <w:pStyle w:val="ListParagraph"/>
+        <w:numPr>
+          <w:ilvl w:val="0"/>
+          <w:numId w:val="7"/>
+        </w:numPr>
+      </w:pPr>
+      <w:r>
+        <w:t>Multiple fittings can run in parallel, speeding up the process</w:t>
+      </w:r>
+    </w:p>
+    <w:p>
+      <w:pPr>
+        <w:rPr>
+          <w:b/>
+        </w:rPr>
+      </w:pPr>
+      <w:r>
+        <w:rPr>
+          <w:b/>
+        </w:rPr>
+        <w:t>Monte Carlo</w:t>
+      </w:r>
+    </w:p>
+    <w:p>
+      <w:pPr>
+        <w:pStyle w:val="ListParagraph"/>
+        <w:numPr>
+          <w:ilvl w:val="0"/>
+          <w:numId w:val="7"/>
+        </w:numPr>
+      </w:pPr>
+      <w:r>
+        <w:t xml:space="preserve">Added </w:t>
+      </w:r>
+      <w:r>
+        <w:t>Normal distributions</w:t>
+      </w:r>
+    </w:p>
+    <w:p>
+      <w:pPr>
+        <w:pStyle w:val="ListParagraph"/>
+        <w:numPr>
+          <w:ilvl w:val="0"/>
+          <w:numId w:val="7"/>
+        </w:numPr>
+      </w:pPr>
+      <w:r>
+        <w:t xml:space="preserve">Added normal distribution for </w:t>
+      </w:r>
+      <w:r>
+        <w:t>diet sampling</w:t>
+      </w:r>
+    </w:p>
+    <w:p>
+      <w:pPr>
+        <w:pStyle w:val="Heading3"/>
+      </w:pPr>
+      <w:r>
+        <w:t>P</w:t>
+      </w:r>
+      <w:r>
+        <w:t>lug-ins</w:t>
+      </w:r>
+    </w:p>
+    <w:p>
+      <w:r>
+        <w:t>N</w:t>
+      </w:r>
+      <w:r>
+        <w:t xml:space="preserve">ew </w:t>
+      </w:r>
+      <w:r>
+        <w:t>plug-ins</w:t>
+      </w:r>
+      <w:r>
         <w:t xml:space="preserve"> </w:t>
       </w:r>
       <w:r>
-        <w:rPr>
-          <w:i/>
-          <w:iCs/>
-        </w:rPr>
-        <w:t>development web</w:t>
-      </w:r>
-      <w:r>
-        <w:rPr>
-          <w:i/>
-          <w:iCs/>
-        </w:rPr>
-        <w:t xml:space="preserve">site </w:t>
-      </w:r>
-      <w:r>
-        <w:rPr>
-          <w:i/>
-          <w:iCs/>
-        </w:rPr>
-        <w:t>is offline.</w:t>
-      </w:r>
-    </w:p>
-    <w:p>
-      <w:pPr>
-        <w:rPr>
-          <w:i/>
-          <w:iCs/>
-        </w:rPr>
-      </w:pPr>
-    </w:p>
-    <w:p>
-      <w:r>
-        <w:t xml:space="preserve">The most important </w:t>
-      </w:r>
-      <w:r>
-        <w:t>n</w:t>
-      </w:r>
-      <w:r>
-        <w:t>ew features in EwE 6.</w:t>
+        <w:t>ha</w:t>
+      </w:r>
+      <w:r>
+        <w:t>ve</w:t>
+      </w:r>
+      <w:r>
+        <w:t xml:space="preserve"> been </w:t>
+      </w:r>
+      <w:r>
+        <w:t>added to EwE 6.</w:t>
       </w:r>
       <w:r>
         <w:t>7</w:t>
       </w:r>
       <w:r>
-        <w:t xml:space="preserve"> are:</w:t>
-      </w:r>
-    </w:p>
-    <w:p>
-      <w:pPr>
-        <w:rPr>
-          <w:b/>
-        </w:rPr>
-      </w:pPr>
+        <w:t>:</w:t>
+      </w:r>
+    </w:p>
+    <w:p>
+      <w:pPr>
+        <w:pStyle w:val="ListParagraph"/>
+        <w:numPr>
+          <w:ilvl w:val="0"/>
+          <w:numId w:val="9"/>
+        </w:numPr>
+      </w:pPr>
+      <w:r>
+        <w:t>Windows Integration</w:t>
+      </w:r>
+    </w:p>
+    <w:p>
+      <w:pPr>
+        <w:pStyle w:val="ListParagraph"/>
+        <w:numPr>
+          <w:ilvl w:val="0"/>
+          <w:numId w:val="9"/>
+        </w:numPr>
+      </w:pPr>
+      <w:r>
+        <w:t>MSP Tools</w:t>
+      </w:r>
+    </w:p>
+    <w:p>
+      <w:pPr>
+        <w:pStyle w:val="ListParagraph"/>
+        <w:numPr>
+          <w:ilvl w:val="0"/>
+          <w:numId w:val="9"/>
+        </w:numPr>
+      </w:pPr>
+      <w:r>
+        <w:t>Fleet trade-off</w:t>
+      </w:r>
+    </w:p>
+    <w:p/>
+    <w:p>
+      <w:pPr>
+        <w:pStyle w:val="Heading3"/>
+      </w:pPr>
+      <w:r>
+        <w:t>Generic additions</w:t>
+      </w:r>
+      <w:r>
+        <w:t xml:space="preserve"> and fixes</w:t>
+      </w:r>
+    </w:p>
+    <w:p>
+      <w:pPr>
+        <w:pStyle w:val="ListParagraph"/>
+        <w:numPr>
+          <w:ilvl w:val="0"/>
+          <w:numId w:val="3"/>
+        </w:numPr>
+      </w:pPr>
+      <w:r>
+        <w:t>EwE models can be exported to .</w:t>
+      </w:r>
       <w:proofErr w:type="spellStart"/>
       <w:r>
-        <w:rPr>
-          <w:b/>
-        </w:rPr>
-        <w:t>Ecopath</w:t>
+        <w:t>eiixml</w:t>
       </w:r>
       <w:proofErr w:type="spellEnd"/>
-    </w:p>
-    <w:p>
-      <w:pPr>
-        <w:pStyle w:val="ListParagraph"/>
-        <w:numPr>
-          <w:ilvl w:val="0"/>
-          <w:numId w:val="10"/>
+      <w:r>
+        <w:t xml:space="preserve"> format from the File menu. XML based model data is useful for running EwE on machines </w:t>
+      </w:r>
+      <w:r>
+        <w:t xml:space="preserve">and operating systems </w:t>
+      </w:r>
+      <w:r>
+        <w:t>where Access is not available. Note that EwE treats XML models as read-only; models will have to be built and fine-tuned using the regular Access-based model files, and should only be exported to XML when finished.</w:t>
+      </w:r>
+    </w:p>
+    <w:p>
+      <w:pPr>
+        <w:pStyle w:val="ListParagraph"/>
+        <w:numPr>
+          <w:ilvl w:val="0"/>
+          <w:numId w:val="3"/>
+        </w:numPr>
+      </w:pPr>
+      <w:r>
+        <w:t>Pedigree definitions can be imported from other EwE models</w:t>
+      </w:r>
+      <w:r>
+        <w:t>.</w:t>
+      </w:r>
+    </w:p>
+    <w:p>
+      <w:pPr>
+        <w:pStyle w:val="ListParagraph"/>
+        <w:numPr>
+          <w:ilvl w:val="0"/>
+          <w:numId w:val="3"/>
+        </w:numPr>
+      </w:pPr>
+      <w:r>
+        <w:t xml:space="preserve">Ecosim allows forcing of </w:t>
+      </w:r>
+      <w:r>
+        <w:t>‘o</w:t>
+      </w:r>
+      <w:r>
+        <w:t>ther mortality rates</w:t>
+      </w:r>
+      <w:r>
+        <w:t>’</w:t>
+      </w:r>
+      <w:r>
+        <w:t xml:space="preserve"> </w:t>
+      </w:r>
+      <w:r>
+        <w:t xml:space="preserve">(M0) </w:t>
+      </w:r>
+      <w:r>
+        <w:t>through forcing functions</w:t>
+      </w:r>
+      <w:r>
+        <w:t>.</w:t>
+      </w:r>
+    </w:p>
+    <w:p>
+      <w:pPr>
+        <w:pStyle w:val="ListParagraph"/>
+        <w:numPr>
+          <w:ilvl w:val="0"/>
+          <w:numId w:val="3"/>
+        </w:numPr>
+      </w:pPr>
+      <w:r>
+        <w:t>Monte Carlo can now save its data in different formats. Rather than only storing results in one massive CSV file, users can opt to store results in one CSV file per result. This new format is easier to read and explore in Excel, and is easier to process through scripts, but fills up your hard drive faster with smaller files.</w:t>
+      </w:r>
+    </w:p>
+    <w:p>
+      <w:pPr>
+        <w:pStyle w:val="ListParagraph"/>
+        <w:numPr>
+          <w:ilvl w:val="0"/>
+          <w:numId w:val="3"/>
+        </w:numPr>
+      </w:pPr>
+      <w:r>
+        <w:t xml:space="preserve">The ‘Change shape’ interface </w:t>
+      </w:r>
+      <w:r>
+        <w:t xml:space="preserve">to change the contours of forcing and mediation functions </w:t>
+      </w:r>
+      <w:r>
+        <w:t>has been overhauled, and new shape types can be added through plug-ins.</w:t>
+      </w:r>
+    </w:p>
+    <w:p>
+      <w:pPr>
+        <w:pStyle w:val="ListParagraph"/>
+        <w:numPr>
+          <w:ilvl w:val="0"/>
+          <w:numId w:val="3"/>
+        </w:numPr>
+      </w:pPr>
+      <w:r>
+        <w:t>Network Analysis no longer immediately runs when launched, preventing unwanted lock-ups for models with complicated diet matrices. The Network Analysis time-out period can now be set from the generic EwE options user interface, too.</w:t>
+      </w:r>
+    </w:p>
+    <w:p>
+      <w:pPr>
+        <w:pStyle w:val="ListParagraph"/>
+        <w:numPr>
+          <w:ilvl w:val="0"/>
+          <w:numId w:val="3"/>
+        </w:numPr>
+      </w:pPr>
+      <w:r>
+        <w:t>More EwE components have been made compliant with the Auto</w:t>
+      </w:r>
+      <w:r>
+        <w:t>-</w:t>
+      </w:r>
+      <w:r>
+        <w:t>save system, which facilitates output collection and running parameter uncertainty assessments through Ecosampler.</w:t>
+      </w:r>
+    </w:p>
+    <w:p>
+      <w:pPr>
+        <w:pStyle w:val="ListParagraph"/>
+        <w:numPr>
+          <w:ilvl w:val="0"/>
+          <w:numId w:val="3"/>
+        </w:numPr>
+      </w:pPr>
+      <w:r>
+        <w:t>One can now define which fraction of a stanza life stage spawns, and the approximate stanza spawning age is now shown in the Edit Stanza graph.</w:t>
+      </w:r>
+    </w:p>
+    <w:p>
+      <w:pPr>
+        <w:pStyle w:val="ListParagraph"/>
+        <w:numPr>
+          <w:ilvl w:val="0"/>
+          <w:numId w:val="3"/>
         </w:numPr>
         <w:rPr>
           <w:bCs/>
         </w:rPr>
       </w:pPr>
+      <w:proofErr w:type="spellStart"/>
       <w:r>
         <w:rPr>
           <w:bCs/>
         </w:rPr>
-        <w:t>Added the ability to link recruitment between stanza groups</w:t>
-      </w:r>
-    </w:p>
-    <w:p>
-      <w:pPr>
-        <w:pStyle w:val="ListParagraph"/>
-        <w:numPr>
-          <w:ilvl w:val="0"/>
-          <w:numId w:val="10"/>
-        </w:numPr>
+        <w:t>Ecosampler</w:t>
+      </w:r>
+      <w:proofErr w:type="spellEnd"/>
+      <w:r>
         <w:rPr>
           <w:bCs/>
         </w:rPr>
-      </w:pPr>
-      <w:r>
-        <w:rPr>
-          <w:bCs/>
-        </w:rPr>
-        <w:t>Off-vessel prices can be negative</w:t>
-      </w:r>
-    </w:p>
-    <w:p>
-      <w:pPr>
-        <w:pStyle w:val="ListParagraph"/>
-        <w:numPr>
-          <w:ilvl w:val="0"/>
-          <w:numId w:val="10"/>
-        </w:numPr>
-        <w:rPr>
-          <w:bCs/>
-        </w:rPr>
-      </w:pPr>
-      <w:r>
-        <w:rPr>
-          <w:bCs/>
-        </w:rPr>
-        <w:t>Added diet tree diagrams</w:t>
-      </w:r>
-    </w:p>
-    <w:p>
-      <w:pPr>
-        <w:rPr>
-          <w:b/>
-        </w:rPr>
-      </w:pPr>
+        <w:t xml:space="preserve"> no longer stores non-balancing models</w:t>
+      </w:r>
+    </w:p>
+    <w:p>
+      <w:pPr>
+        <w:pStyle w:val="ListParagraph"/>
+        <w:numPr>
+          <w:ilvl w:val="0"/>
+          <w:numId w:val="3"/>
+        </w:numPr>
+      </w:pPr>
+      <w:r>
+        <w:t xml:space="preserve">The EwE user guide has FINALLY been rewritten as two separate documents: a textbook and a user guide. The documents are web-based and based on </w:t>
+      </w:r>
       <w:proofErr w:type="spellStart"/>
       <w:r>
-        <w:rPr>
-          <w:b/>
-        </w:rPr>
-        <w:t>Ecosim</w:t>
+        <w:t>PressBooks</w:t>
       </w:r>
       <w:proofErr w:type="spellEnd"/>
-    </w:p>
-    <w:p>
-      <w:pPr>
-        <w:pStyle w:val="ListParagraph"/>
-        <w:numPr>
-          <w:ilvl w:val="0"/>
-          <w:numId w:val="11"/>
-        </w:numPr>
-      </w:pPr>
-      <w:r>
-        <w:t>Added g</w:t>
-      </w:r>
-      <w:r>
-        <w:t>roup and fleet plots</w:t>
-      </w:r>
-    </w:p>
-    <w:p>
-      <w:pPr>
-        <w:pStyle w:val="ListParagraph"/>
-        <w:numPr>
-          <w:ilvl w:val="0"/>
-          <w:numId w:val="11"/>
-        </w:numPr>
-      </w:pPr>
-      <w:r>
-        <w:t xml:space="preserve">Added new time series to dynamically alter </w:t>
-      </w:r>
-      <w:proofErr w:type="spellStart"/>
-      <w:r>
-        <w:t>Ecopath</w:t>
-      </w:r>
-      <w:proofErr w:type="spellEnd"/>
-      <w:r>
-        <w:t xml:space="preserve"> fishing costs proportions, prices</w:t>
-      </w:r>
-    </w:p>
-    <w:p>
-      <w:pPr>
-        <w:pStyle w:val="ListParagraph"/>
-        <w:numPr>
-          <w:ilvl w:val="0"/>
-          <w:numId w:val="11"/>
-        </w:numPr>
-      </w:pPr>
-      <w:r>
-        <w:t>Added non-additive mortalities</w:t>
-      </w:r>
-    </w:p>
-    <w:p>
-      <w:pPr>
-        <w:pStyle w:val="ListParagraph"/>
-        <w:numPr>
-          <w:ilvl w:val="0"/>
-          <w:numId w:val="11"/>
-        </w:numPr>
-      </w:pPr>
-      <w:r>
-        <w:t>Added d</w:t>
-      </w:r>
-      <w:r>
-        <w:t xml:space="preserve">iscard rate and discard mortality rates forcing in </w:t>
-      </w:r>
-      <w:proofErr w:type="spellStart"/>
-      <w:r>
-        <w:t>Ecosim</w:t>
-      </w:r>
-      <w:proofErr w:type="spellEnd"/>
-      <w:r>
-        <w:t>, and model fitting to discards and landings time series.</w:t>
-      </w:r>
-    </w:p>
-    <w:p>
-      <w:pPr>
-        <w:pStyle w:val="ListParagraph"/>
-        <w:numPr>
-          <w:ilvl w:val="0"/>
-          <w:numId w:val="11"/>
-        </w:numPr>
-      </w:pPr>
-      <w:r>
-        <w:t>Catchabilities</w:t>
-      </w:r>
-      <w:r>
-        <w:t xml:space="preserve"> are now available as a new time series type</w:t>
-      </w:r>
-    </w:p>
-    <w:p>
-      <w:pPr>
-        <w:pStyle w:val="ListParagraph"/>
-        <w:numPr>
-          <w:ilvl w:val="0"/>
-          <w:numId w:val="11"/>
-        </w:numPr>
-      </w:pPr>
-      <w:r>
-        <w:t xml:space="preserve">Catch time series </w:t>
-      </w:r>
-      <w:r>
-        <w:t xml:space="preserve">(61) are </w:t>
-      </w:r>
-      <w:r>
-        <w:t>now included in SS calculations; SS will differ</w:t>
-      </w:r>
-      <w:r>
-        <w:t xml:space="preserve"> from </w:t>
-      </w:r>
-      <w:proofErr w:type="spellStart"/>
-      <w:r>
-        <w:t>EwE</w:t>
-      </w:r>
-      <w:proofErr w:type="spellEnd"/>
-      <w:r>
-        <w:t xml:space="preserve"> 6.6.*</w:t>
-      </w:r>
-    </w:p>
-    <w:p>
-      <w:pPr>
-        <w:pStyle w:val="ListParagraph"/>
-        <w:numPr>
-          <w:ilvl w:val="0"/>
-          <w:numId w:val="11"/>
-        </w:numPr>
-      </w:pPr>
-      <w:r>
-        <w:t xml:space="preserve">Display of </w:t>
-      </w:r>
-      <w:r>
-        <w:t xml:space="preserve">time series </w:t>
-      </w:r>
-      <w:r>
-        <w:t>has been standardized</w:t>
-      </w:r>
-    </w:p>
-    <w:p>
-      <w:pPr>
-        <w:pStyle w:val="Heading3"/>
-      </w:pPr>
-      <w:r>
-        <w:t>Ecospace</w:t>
-      </w:r>
-    </w:p>
-    <w:p>
-      <w:pPr>
-        <w:pStyle w:val="ListParagraph"/>
-        <w:numPr>
-          <w:ilvl w:val="0"/>
-          <w:numId w:val="6"/>
-        </w:numPr>
-      </w:pPr>
-      <w:r>
-        <w:t>The spatial temporal framework (available through projects) can drive current patterns, too.</w:t>
-      </w:r>
-    </w:p>
-    <w:p>
-      <w:pPr>
-        <w:pStyle w:val="ListParagraph"/>
-        <w:numPr>
-          <w:ilvl w:val="0"/>
-          <w:numId w:val="6"/>
-        </w:numPr>
-      </w:pPr>
-      <w:r>
-        <w:t>Added c</w:t>
-      </w:r>
-      <w:r>
-        <w:t>ell area</w:t>
-      </w:r>
-      <w:r>
-        <w:t xml:space="preserve"> maps</w:t>
-      </w:r>
-    </w:p>
-    <w:p>
-      <w:pPr>
-        <w:pStyle w:val="ListParagraph"/>
-        <w:numPr>
-          <w:ilvl w:val="0"/>
-          <w:numId w:val="6"/>
-        </w:numPr>
-      </w:pPr>
-      <w:r>
-        <w:t xml:space="preserve">Added </w:t>
-      </w:r>
-      <w:r>
-        <w:t>Effort zones</w:t>
-      </w:r>
-      <w:r>
-        <w:t xml:space="preserve"> maps</w:t>
-      </w:r>
-    </w:p>
-    <w:p>
-      <w:pPr>
-        <w:pStyle w:val="ListParagraph"/>
-        <w:numPr>
-          <w:ilvl w:val="0"/>
-          <w:numId w:val="6"/>
-        </w:numPr>
-      </w:pPr>
-      <w:r>
-        <w:t xml:space="preserve">The </w:t>
-      </w:r>
-      <w:r>
-        <w:t xml:space="preserve">IBM </w:t>
-      </w:r>
-      <w:r>
-        <w:t xml:space="preserve">model has been </w:t>
-      </w:r>
-      <w:r>
-        <w:t>made to work with currents</w:t>
-      </w:r>
-      <w:r>
-        <w:t xml:space="preserve"> and</w:t>
-      </w:r>
-      <w:r>
-        <w:t xml:space="preserve"> </w:t>
-      </w:r>
-      <w:proofErr w:type="spellStart"/>
-      <w:r>
-        <w:t>EcoTracer</w:t>
-      </w:r>
-      <w:proofErr w:type="spellEnd"/>
-    </w:p>
-    <w:p>
-      <w:pPr>
-        <w:pStyle w:val="ListParagraph"/>
-        <w:numPr>
-          <w:ilvl w:val="0"/>
-          <w:numId w:val="6"/>
-        </w:numPr>
-      </w:pPr>
-      <w:r>
-        <w:t>Expanded regional averages output: consumption. Region 0 provides total Ecospace water cell average, weighted by cell area</w:t>
-      </w:r>
-    </w:p>
-    <w:p>
-      <w:pPr>
-        <w:rPr>
-          <w:b/>
-        </w:rPr>
-      </w:pPr>
-      <w:r>
-        <w:rPr>
-          <w:b/>
-        </w:rPr>
-        <w:t>Stepwise fitting</w:t>
-      </w:r>
-    </w:p>
-    <w:p>
-      <w:pPr>
-        <w:pStyle w:val="ListParagraph"/>
-        <w:numPr>
-          <w:ilvl w:val="0"/>
-          <w:numId w:val="7"/>
-        </w:numPr>
-      </w:pPr>
-      <w:r>
-        <w:t>Added the ability to m</w:t>
-      </w:r>
-      <w:r>
-        <w:t>ulti-thread</w:t>
-      </w:r>
-      <w:r>
-        <w:t xml:space="preserve"> the STF</w:t>
-      </w:r>
-    </w:p>
-    <w:p>
-      <w:pPr>
-        <w:rPr>
-          <w:b/>
-        </w:rPr>
-      </w:pPr>
-      <w:r>
-        <w:rPr>
-          <w:b/>
-        </w:rPr>
-        <w:t>Monte Carlo</w:t>
-      </w:r>
-    </w:p>
-    <w:p>
-      <w:pPr>
-        <w:pStyle w:val="ListParagraph"/>
-        <w:numPr>
-          <w:ilvl w:val="0"/>
-          <w:numId w:val="7"/>
-        </w:numPr>
-      </w:pPr>
-      <w:r>
-        <w:t xml:space="preserve">Added </w:t>
-      </w:r>
-      <w:r>
-        <w:t>Normal distributions</w:t>
-      </w:r>
-    </w:p>
-    <w:p>
-      <w:pPr>
-        <w:pStyle w:val="ListParagraph"/>
-        <w:numPr>
-          <w:ilvl w:val="0"/>
-          <w:numId w:val="7"/>
-        </w:numPr>
-      </w:pPr>
-      <w:r>
-        <w:t xml:space="preserve">Added normal distribution for </w:t>
-      </w:r>
-      <w:r>
-        <w:t>diet sampling</w:t>
-      </w:r>
-    </w:p>
-    <w:p>
-      <w:pPr>
-        <w:pStyle w:val="Heading3"/>
-      </w:pPr>
-      <w:r>
-        <w:t>P</w:t>
-      </w:r>
-      <w:r>
-        <w:t>lug-ins</w:t>
-      </w:r>
-    </w:p>
-    <w:p>
-      <w:r>
-        <w:t>N</w:t>
-      </w:r>
-      <w:r>
-        <w:t xml:space="preserve">ew </w:t>
-      </w:r>
-      <w:r>
-        <w:t>plug-ins</w:t>
-      </w:r>
-      <w:r>
-        <w:t xml:space="preserve"> </w:t>
-      </w:r>
-      <w:r>
-        <w:t>ha</w:t>
-      </w:r>
-      <w:r>
-        <w:t>ve</w:t>
-      </w:r>
-      <w:r>
-        <w:t xml:space="preserve"> been </w:t>
-      </w:r>
-      <w:r>
-        <w:t xml:space="preserve">added to </w:t>
-      </w:r>
-      <w:proofErr w:type="spellStart"/>
-      <w:r>
-        <w:t>EwE</w:t>
-      </w:r>
-      <w:proofErr w:type="spellEnd"/>
-      <w:r>
-        <w:t xml:space="preserve"> 6.</w:t>
-      </w:r>
-      <w:r>
-        <w:t>7</w:t>
-      </w:r>
-      <w:r>
-        <w:t>:</w:t>
-      </w:r>
-    </w:p>
-    <w:p>
-      <w:pPr>
-        <w:pStyle w:val="ListParagraph"/>
-        <w:numPr>
-          <w:ilvl w:val="0"/>
-          <w:numId w:val="9"/>
-        </w:numPr>
-      </w:pPr>
-      <w:r>
-        <w:t>Windows Integration</w:t>
-      </w:r>
-    </w:p>
-    <w:p>
-      <w:pPr>
-        <w:pStyle w:val="ListParagraph"/>
-        <w:numPr>
-          <w:ilvl w:val="0"/>
-          <w:numId w:val="9"/>
-        </w:numPr>
-      </w:pPr>
-      <w:r>
-        <w:t>MSP Tools</w:t>
-      </w:r>
-    </w:p>
-    <w:p/>
-    <w:p>
-      <w:pPr>
-        <w:pStyle w:val="Heading3"/>
-      </w:pPr>
-      <w:r>
-        <w:t>Generic additions</w:t>
-      </w:r>
-      <w:r>
-        <w:t xml:space="preserve"> and fixes</w:t>
-      </w:r>
-    </w:p>
-    <w:p>
-      <w:pPr>
-        <w:pStyle w:val="ListParagraph"/>
-        <w:numPr>
-          <w:ilvl w:val="0"/>
-          <w:numId w:val="3"/>
-        </w:numPr>
-      </w:pPr>
-      <w:r>
-        <w:t xml:space="preserve">EwE models can be exported </w:t>
-      </w:r>
-      <w:proofErr w:type="gramStart"/>
-      <w:r>
-        <w:t>to .</w:t>
-      </w:r>
-      <w:proofErr w:type="spellStart"/>
-      <w:r>
-        <w:t>eiixml</w:t>
-      </w:r>
-      <w:proofErr w:type="spellEnd"/>
-      <w:proofErr w:type="gramEnd"/>
-      <w:r>
-        <w:t xml:space="preserve"> format from the File menu. XML based model data is useful for running EwE on machines </w:t>
-      </w:r>
-      <w:r>
-        <w:t xml:space="preserve">and operating systems </w:t>
-      </w:r>
-      <w:r>
-        <w:t>where Access is not available. Note that EwE treats XML models as read-only; models will have to be built and fine-tuned using the regular Access-based model files, and should only be exported to XML when finished.</w:t>
-      </w:r>
-    </w:p>
-    <w:p>
-      <w:pPr>
-        <w:pStyle w:val="ListParagraph"/>
-        <w:numPr>
-          <w:ilvl w:val="0"/>
-          <w:numId w:val="3"/>
-        </w:numPr>
-      </w:pPr>
-      <w:r>
-        <w:t>Pedigree definitions can be imported from other EwE models</w:t>
-      </w:r>
-      <w:r>
-        <w:t>.</w:t>
-      </w:r>
-    </w:p>
-    <w:p>
-      <w:pPr>
-        <w:pStyle w:val="ListParagraph"/>
-        <w:numPr>
-          <w:ilvl w:val="0"/>
-          <w:numId w:val="3"/>
-        </w:numPr>
-      </w:pPr>
-      <w:r>
-        <w:t xml:space="preserve">Ecosim allows forcing of </w:t>
-      </w:r>
-      <w:r>
-        <w:t>‘o</w:t>
-      </w:r>
-      <w:r>
-        <w:t>ther mortality rates</w:t>
-      </w:r>
-      <w:r>
-        <w:t>’</w:t>
-      </w:r>
-      <w:r>
-        <w:t xml:space="preserve"> </w:t>
-      </w:r>
-      <w:r>
-        <w:t xml:space="preserve">(M0) </w:t>
-      </w:r>
-      <w:r>
-        <w:t>through forcing functions</w:t>
-      </w:r>
-      <w:r>
-        <w:t>.</w:t>
-      </w:r>
-    </w:p>
-    <w:p>
-      <w:pPr>
-        <w:pStyle w:val="ListParagraph"/>
-        <w:numPr>
-          <w:ilvl w:val="0"/>
-          <w:numId w:val="3"/>
-        </w:numPr>
-      </w:pPr>
-      <w:r>
-        <w:t>Monte Carlo can now save its data in different formats. Rather than only storing results in one massive CSV file, users can opt to store results in one CSV file per result. This new format is easier to read and explore in Excel, and is easier to process through scripts, but fills up your hard drive faster with smaller files.</w:t>
-      </w:r>
-    </w:p>
-    <w:p>
-      <w:pPr>
-        <w:pStyle w:val="ListParagraph"/>
-        <w:numPr>
-          <w:ilvl w:val="0"/>
-          <w:numId w:val="3"/>
-        </w:numPr>
-      </w:pPr>
-      <w:r>
-        <w:t xml:space="preserve">The ‘Change shape’ interface </w:t>
-      </w:r>
-      <w:r>
-        <w:t xml:space="preserve">to change the contours of forcing and mediation functions </w:t>
-      </w:r>
-      <w:r>
-        <w:t>has been overhauled, and new shape types can be added through plug-ins.</w:t>
-      </w:r>
-    </w:p>
-    <w:p>
-      <w:pPr>
-        <w:pStyle w:val="ListParagraph"/>
-        <w:numPr>
-          <w:ilvl w:val="0"/>
-          <w:numId w:val="3"/>
-        </w:numPr>
-      </w:pPr>
-      <w:r>
-        <w:t>Network Analysis no longer immediately runs when launched, preventing unwanted lock-ups for models with complicated diet matrices. The Network Analysis time-out period can now be set from the generic EwE options user interface, too.</w:t>
-      </w:r>
-    </w:p>
-    <w:p>
-      <w:pPr>
-        <w:pStyle w:val="ListParagraph"/>
-        <w:numPr>
-          <w:ilvl w:val="0"/>
-          <w:numId w:val="3"/>
-        </w:numPr>
-      </w:pPr>
-      <w:r>
-        <w:t>More EwE components have been made compliant with the Auto</w:t>
-      </w:r>
-      <w:r>
-        <w:t>-</w:t>
-      </w:r>
-      <w:r>
-        <w:t>save system, which facilitates output collection and running parameter uncertainty assessments through Ecosampler.</w:t>
-      </w:r>
-    </w:p>
-    <w:p>
-      <w:pPr>
-        <w:pStyle w:val="ListParagraph"/>
-        <w:numPr>
-          <w:ilvl w:val="0"/>
-          <w:numId w:val="3"/>
-        </w:numPr>
-      </w:pPr>
-      <w:r>
-        <w:t>One can now define which fraction of a stanza life stage spawns, and the approximate stanza spawning age is now shown in the Edit Stanza graph.</w:t>
-      </w:r>
-    </w:p>
-    <w:p>
-      <w:pPr>
-        <w:pStyle w:val="ListParagraph"/>
-        <w:numPr>
-          <w:ilvl w:val="0"/>
-          <w:numId w:val="3"/>
-        </w:numPr>
-        <w:rPr>
-          <w:bCs/>
-        </w:rPr>
-      </w:pPr>
-      <w:proofErr w:type="spellStart"/>
-      <w:r>
-        <w:rPr>
-          <w:bCs/>
-        </w:rPr>
-        <w:t>Ecosampler</w:t>
-      </w:r>
-      <w:proofErr w:type="spellEnd"/>
-      <w:r>
-        <w:rPr>
-          <w:bCs/>
-        </w:rPr>
-        <w:t xml:space="preserve"> no longer stores non-balancing models</w:t>
-      </w:r>
-    </w:p>
-    <w:p>
-      <w:pPr>
-        <w:pStyle w:val="ListParagraph"/>
-        <w:numPr>
-          <w:ilvl w:val="0"/>
-          <w:numId w:val="3"/>
-        </w:numPr>
-      </w:pPr>
-      <w:r>
-        <w:t xml:space="preserve">The </w:t>
-      </w:r>
-      <w:proofErr w:type="spellStart"/>
-      <w:r>
-        <w:t>EwE</w:t>
-      </w:r>
-      <w:proofErr w:type="spellEnd"/>
-      <w:r>
-        <w:t xml:space="preserve"> user guide has FINALLY been rewritten as two separate documents: a textbook and a user guide. The documents are web-based and based on </w:t>
-      </w:r>
-      <w:proofErr w:type="spellStart"/>
-      <w:r>
-        <w:t>PressBooks</w:t>
-      </w:r>
-      <w:proofErr w:type="spellEnd"/>
-      <w:r>
-        <w:t xml:space="preserve">, meaning that anyone interested can contribute to existing text or add new passages. Our next priority is to connect the new manuals directly to the </w:t>
-      </w:r>
-      <w:proofErr w:type="spellStart"/>
-      <w:r>
-        <w:t>EwE</w:t>
-      </w:r>
-      <w:proofErr w:type="spellEnd"/>
-      <w:r>
-        <w:t xml:space="preserve"> software help system (F1)</w:t>
+      <w:r>
+        <w:t>, meaning that anyone interested can contribute to existing text or add new passages. Our next priority is to connect the new manuals directly to the EwE software help system (F1)</w:t>
       </w:r>
     </w:p>
     <w:p>
@@ -921,7 +817,13 @@
       </w:r>
       <w:proofErr w:type="spellEnd"/>
       <w:r>
-        <w:t xml:space="preserve"> colour schemes</w:t>
+        <w:t xml:space="preserve"> </w:t>
+      </w:r>
+      <w:r>
+        <w:t xml:space="preserve">colourblind </w:t>
+      </w:r>
+      <w:r>
+        <w:t>colour schemes</w:t>
       </w:r>
     </w:p>
     <w:p>
@@ -984,7 +886,22 @@
         </w:numPr>
       </w:pPr>
       <w:r>
-        <w:t>Ecospace layer data drag-and-drop</w:t>
+        <w:t xml:space="preserve">Ecospace layer data </w:t>
+      </w:r>
+      <w:r>
+        <w:t xml:space="preserve">can be </w:t>
+      </w:r>
+      <w:r>
+        <w:t>drag</w:t>
+      </w:r>
+      <w:r>
+        <w:t>ged</w:t>
+      </w:r>
+      <w:r>
+        <w:t>-and-drop</w:t>
+      </w:r>
+      <w:r>
+        <w:t>ped</w:t>
       </w:r>
     </w:p>
     <w:p>
@@ -996,7 +913,7 @@
         </w:numPr>
       </w:pPr>
       <w:r>
-        <w:t>Import and export Ecospace layer styles between layers, and across models (plug-in)</w:t>
+        <w:t>Import and export Ecospace layer styles between layers, and across models</w:t>
       </w:r>
     </w:p>
     <w:p>
@@ -1008,6 +925,31 @@
         </w:numPr>
       </w:pPr>
       <w:r>
+        <w:t>The Ecospace fishing cost calculations now correctly works around land masses</w:t>
+      </w:r>
+    </w:p>
+    <w:p>
+      <w:pPr>
+        <w:pStyle w:val="ListParagraph"/>
+        <w:numPr>
+          <w:ilvl w:val="1"/>
+          <w:numId w:val="3"/>
+        </w:numPr>
+      </w:pPr>
+      <w:r>
+        <w:t>Ecospace external data definitions can be imported from other external data files</w:t>
+      </w:r>
+    </w:p>
+    <w:p>
+      <w:pPr>
+        <w:pStyle w:val="ListParagraph"/>
+        <w:numPr>
+          <w:ilvl w:val="1"/>
+          <w:numId w:val="3"/>
+        </w:numPr>
+      </w:pPr>
+      <w:r>
+        <w:lastRenderedPageBreak/>
         <w:t xml:space="preserve">For a complete list of changes, please refer to the </w:t>
       </w:r>
       <w:hyperlink r:id="rId7" w:history="1">
@@ -1024,23 +966,9 @@
     </w:p>
     <w:p>
       <w:pPr>
-        <w:rPr>
-          <w:rFonts w:eastAsiaTheme="majorEastAsia" w:cstheme="majorBidi"/>
-          <w:b/>
-          <w:sz w:val="26"/>
-          <w:szCs w:val="26"/>
-        </w:rPr>
-      </w:pPr>
-      <w:r>
-        <w:br w:type="page"/>
-      </w:r>
-    </w:p>
-    <w:p>
-      <w:pPr>
         <w:pStyle w:val="Heading2"/>
       </w:pPr>
       <w:r>
-        <w:lastRenderedPageBreak/>
         <w:t>Known issues</w:t>
       </w:r>
     </w:p>
@@ -1089,41 +1017,41 @@
       </w:r>
       <w:proofErr w:type="spellStart"/>
       <w:r>
+        <w:t>ActNow</w:t>
+      </w:r>
+      <w:proofErr w:type="spellEnd"/>
+      <w:r>
+        <w:t xml:space="preserve">, </w:t>
+      </w:r>
+      <w:proofErr w:type="spellStart"/>
+      <w:r>
         <w:t>EcoScope</w:t>
       </w:r>
       <w:proofErr w:type="spellEnd"/>
       <w:r>
-        <w:t xml:space="preserve"> and </w:t>
-      </w:r>
-      <w:proofErr w:type="spellStart"/>
-      <w:r>
-        <w:t>MarinePlan</w:t>
-      </w:r>
-      <w:proofErr w:type="spellEnd"/>
+        <w:t xml:space="preserve"> and MarinePlan.</w:t>
+      </w:r>
+    </w:p>
+    <w:p>
+      <w:r>
+        <w:t>Development of EwE is coordinated through Ecopath International Initiative Research Association (</w:t>
+      </w:r>
+      <w:r>
+        <w:t>EII) in Barcelona, Spain</w:t>
+      </w:r>
       <w:r>
         <w:t>.</w:t>
       </w:r>
     </w:p>
     <w:p>
-      <w:r>
-        <w:t>Development of EwE is coordinated through Ecopath International Initiative Research Association (</w:t>
-      </w:r>
-      <w:r>
-        <w:t>EII) in Barcelona, Spain</w:t>
-      </w:r>
-      <w:r>
-        <w:t>.</w:t>
-      </w:r>
-    </w:p>
-    <w:p>
       <w:pPr>
         <w:pStyle w:val="Heading1"/>
       </w:pPr>
       <w:r>
-        <w:br/>
-      </w:r>
-      <w:r>
-        <w:t>Be involved</w:t>
+        <w:t xml:space="preserve">Get </w:t>
+      </w:r>
+      <w:r>
+        <w:t>involved</w:t>
       </w:r>
     </w:p>
     <w:p>
@@ -1473,41 +1401,25 @@
         <w:br/>
       </w:r>
       <w:hyperlink r:id="rId14" w:history="1">
-        <w:proofErr w:type="spellStart"/>
         <w:r>
           <w:rPr>
             <w:rStyle w:val="Hyperlink"/>
           </w:rPr>
-          <w:t>EwE</w:t>
+          <w:t>EwE text book</w:t>
         </w:r>
-        <w:proofErr w:type="spellEnd"/>
+      </w:hyperlink>
+      <w:r>
+        <w:rPr>
+          <w:rStyle w:val="Hyperlink"/>
+        </w:rPr>
+        <w:br/>
+      </w:r>
+      <w:hyperlink r:id="rId15" w:history="1">
         <w:r>
           <w:rPr>
             <w:rStyle w:val="Hyperlink"/>
           </w:rPr>
-          <w:t xml:space="preserve"> text book</w:t>
-        </w:r>
-      </w:hyperlink>
-      <w:r>
-        <w:rPr>
-          <w:rStyle w:val="Hyperlink"/>
-        </w:rPr>
-        <w:br/>
-      </w:r>
-      <w:hyperlink r:id="rId15" w:history="1">
-        <w:proofErr w:type="spellStart"/>
-        <w:r>
-          <w:rPr>
-            <w:rStyle w:val="Hyperlink"/>
-          </w:rPr>
-          <w:t>EwE</w:t>
-        </w:r>
-        <w:proofErr w:type="spellEnd"/>
-        <w:r>
-          <w:rPr>
-            <w:rStyle w:val="Hyperlink"/>
-          </w:rPr>
-          <w:t xml:space="preserve"> user guide</w:t>
+          <w:t>EwE user guide</w:t>
         </w:r>
       </w:hyperlink>
     </w:p>
@@ -1569,12 +1481,6 @@
           <w:t>Ecopath on Facebook</w:t>
         </w:r>
       </w:hyperlink>
-      <w:r>
-        <w:br/>
-      </w:r>
-      <w:r>
-        <w:br/>
-      </w:r>
     </w:p>
     <w:p>
       <w:pPr>
@@ -1595,7 +1501,7 @@
 </file>
 
 <file path=word/numbering.xml><?xml version="1.0" encoding="utf-8"?>
-<w:numbering xmlns:wpc="http://schemas.microsoft.com/office/word/2010/wordprocessingCanvas" xmlns:cx="http://schemas.microsoft.com/office/drawing/2014/chartex" xmlns:cx1="http://schemas.microsoft.com/office/drawing/2015/9/8/chartex" xmlns:cx2="http://schemas.microsoft.com/office/drawing/2015/10/21/chartex" xmlns:cx3="http://schemas.microsoft.com/office/drawing/2016/5/9/chartex" xmlns:cx4="http://schemas.microsoft.com/office/drawing/2016/5/10/chartex" xmlns:cx5="http://schemas.microsoft.com/office/drawing/2016/5/11/chartex" xmlns:cx6="http://schemas.microsoft.com/office/drawing/2016/5/12/chartex" xmlns:cx7="http://schemas.microsoft.com/office/drawing/2016/5/13/chartex" xmlns:cx8="http://schemas.microsoft.com/office/drawing/2016/5/14/chartex" xmlns:mc="http://schemas.openxmlformats.org/markup-compatibility/2006" xmlns:aink="http://schemas.microsoft.com/office/drawing/2016/ink" xmlns:am3d="http://schemas.microsoft.com/office/drawing/2017/model3d" xmlns:o="urn:schemas-microsoft-com:office:office" xmlns:oel="http://schemas.microsoft.com/office/2019/extlst" xmlns:r="http://schemas.openxmlformats.org/officeDocument/2006/relationships" xmlns:m="http://schemas.openxmlformats.org/officeDocument/2006/math" xmlns:v="urn:schemas-microsoft-com:vml" xmlns:wp14="http://schemas.microsoft.com/office/word/2010/wordprocessingDrawing" xmlns:wp="http://schemas.openxmlformats.org/drawingml/2006/wordprocessingDrawing" xmlns:w10="urn:schemas-microsoft-com:office:word" xmlns:w="http://schemas.openxmlformats.org/wordprocessingml/2006/main" xmlns:w14="http://schemas.microsoft.com/office/word/2010/wordml" xmlns:w15="http://schemas.microsoft.com/office/word/2012/wordml" xmlns:w16cex="http://schemas.microsoft.com/office/word/2018/wordml/cex" xmlns:w16cid="http://schemas.microsoft.com/office/word/2016/wordml/cid" xmlns:w16="http://schemas.microsoft.com/office/word/2018/wordml" xmlns:w16du="http://schemas.microsoft.com/office/word/2023/wordml/word16du" xmlns:w16sdtdh="http://schemas.microsoft.com/office/word/2020/wordml/sdtdatahash" xmlns:w16se="http://schemas.microsoft.com/office/word/2015/wordml/symex" xmlns:wpg="http://schemas.microsoft.com/office/word/2010/wordprocessingGroup" xmlns:wpi="http://schemas.microsoft.com/office/word/2010/wordprocessingInk" xmlns:wne="http://schemas.microsoft.com/office/word/2006/wordml" xmlns:wps="http://schemas.microsoft.com/office/word/2010/wordprocessingShape" mc:Ignorable="w14 w15 w16se w16cid w16 w16cex w16sdtdh w16du wp14">
+<w:numbering xmlns:wpc="http://schemas.microsoft.com/office/word/2010/wordprocessingCanvas" xmlns:cx="http://schemas.microsoft.com/office/drawing/2014/chartex" xmlns:cx1="http://schemas.microsoft.com/office/drawing/2015/9/8/chartex" xmlns:cx2="http://schemas.microsoft.com/office/drawing/2015/10/21/chartex" xmlns:cx3="http://schemas.microsoft.com/office/drawing/2016/5/9/chartex" xmlns:cx4="http://schemas.microsoft.com/office/drawing/2016/5/10/chartex" xmlns:cx5="http://schemas.microsoft.com/office/drawing/2016/5/11/chartex" xmlns:cx6="http://schemas.microsoft.com/office/drawing/2016/5/12/chartex" xmlns:cx7="http://schemas.microsoft.com/office/drawing/2016/5/13/chartex" xmlns:cx8="http://schemas.microsoft.com/office/drawing/2016/5/14/chartex" xmlns:mc="http://schemas.openxmlformats.org/markup-compatibility/2006" xmlns:aink="http://schemas.microsoft.com/office/drawing/2016/ink" xmlns:am3d="http://schemas.microsoft.com/office/drawing/2017/model3d" xmlns:o="urn:schemas-microsoft-com:office:office" xmlns:oel="http://schemas.microsoft.com/office/2019/extlst" xmlns:r="http://schemas.openxmlformats.org/officeDocument/2006/relationships" xmlns:m="http://schemas.openxmlformats.org/officeDocument/2006/math" xmlns:v="urn:schemas-microsoft-com:vml" xmlns:wp14="http://schemas.microsoft.com/office/word/2010/wordprocessingDrawing" xmlns:wp="http://schemas.openxmlformats.org/drawingml/2006/wordprocessingDrawing" xmlns:w10="urn:schemas-microsoft-com:office:word" xmlns:w="http://schemas.openxmlformats.org/wordprocessingml/2006/main" xmlns:w14="http://schemas.microsoft.com/office/word/2010/wordml" xmlns:w15="http://schemas.microsoft.com/office/word/2012/wordml" xmlns:w16cex="http://schemas.microsoft.com/office/word/2018/wordml/cex" xmlns:w16cid="http://schemas.microsoft.com/office/word/2016/wordml/cid" xmlns:w16="http://schemas.microsoft.com/office/word/2018/wordml" xmlns:w16du="http://schemas.microsoft.com/office/word/2023/wordml/word16du" xmlns:w16sdtdh="http://schemas.microsoft.com/office/word/2020/wordml/sdtdatahash" xmlns:w16sdtfl="http://schemas.microsoft.com/office/word/2024/wordml/sdtformatlock" xmlns:w16se="http://schemas.microsoft.com/office/word/2015/wordml/symex" xmlns:wpg="http://schemas.microsoft.com/office/word/2010/wordprocessingGroup" xmlns:wpi="http://schemas.microsoft.com/office/word/2010/wordprocessingInk" xmlns:wne="http://schemas.microsoft.com/office/word/2006/wordml" xmlns:wps="http://schemas.microsoft.com/office/word/2010/wordprocessingShape" mc:Ignorable="w14 w15 w16se w16cid w16 w16cex w16sdtdh w16sdtfl w16du wp14">
   <w:abstractNum w:abstractNumId="0" w15:restartNumberingAfterBreak="0">
     <w:nsid w:val="0D162509"/>
     <w:multiLevelType w:val="hybridMultilevel"/>
@@ -2876,7 +2782,7 @@
 </file>
 
 <file path=word/styles.xml><?xml version="1.0" encoding="utf-8"?>
-<w:styles xmlns:mc="http://schemas.openxmlformats.org/markup-compatibility/2006" xmlns:r="http://schemas.openxmlformats.org/officeDocument/2006/relationships" xmlns:w="http://schemas.openxmlformats.org/wordprocessingml/2006/main" xmlns:w14="http://schemas.microsoft.com/office/word/2010/wordml" xmlns:w15="http://schemas.microsoft.com/office/word/2012/wordml" xmlns:w16cex="http://schemas.microsoft.com/office/word/2018/wordml/cex" xmlns:w16cid="http://schemas.microsoft.com/office/word/2016/wordml/cid" xmlns:w16="http://schemas.microsoft.com/office/word/2018/wordml" xmlns:w16du="http://schemas.microsoft.com/office/word/2023/wordml/word16du" xmlns:w16sdtdh="http://schemas.microsoft.com/office/word/2020/wordml/sdtdatahash" xmlns:w16se="http://schemas.microsoft.com/office/word/2015/wordml/symex" mc:Ignorable="w14 w15 w16se w16cid w16 w16cex w16sdtdh w16du">
+<w:styles xmlns:mc="http://schemas.openxmlformats.org/markup-compatibility/2006" xmlns:r="http://schemas.openxmlformats.org/officeDocument/2006/relationships" xmlns:w="http://schemas.openxmlformats.org/wordprocessingml/2006/main" xmlns:w14="http://schemas.microsoft.com/office/word/2010/wordml" xmlns:w15="http://schemas.microsoft.com/office/word/2012/wordml" xmlns:w16cex="http://schemas.microsoft.com/office/word/2018/wordml/cex" xmlns:w16cid="http://schemas.microsoft.com/office/word/2016/wordml/cid" xmlns:w16="http://schemas.microsoft.com/office/word/2018/wordml" xmlns:w16du="http://schemas.microsoft.com/office/word/2023/wordml/word16du" xmlns:w16sdtdh="http://schemas.microsoft.com/office/word/2020/wordml/sdtdatahash" xmlns:w16sdtfl="http://schemas.microsoft.com/office/word/2024/wordml/sdtformatlock" xmlns:w16se="http://schemas.microsoft.com/office/word/2015/wordml/symex" mc:Ignorable="w14 w15 w16se w16cid w16 w16cex w16sdtdh w16sdtfl w16du">
   <w:docDefaults>
     <w:rPrDefault>
       <w:rPr>

</xml_diff>